<commit_message>
docs(A2): convert video storyboard to solo presentation
All narration is now David's; the unit-testing, API-testing and GitHub
sections are reattributed from the withdrawn teammate to David. Intro
states the solo status; team-collaboration segment reframed as an
individual demonstration of the GitHub workflow.

Co-Authored-By: Claude Opus 4.8 <noreply@anthropic.com>
Claude-Session: https://claude.ai/code/session_018qvo2YYVSdyAShj3w4tzaz
</commit_message>
<xml_diff>
--- a/docs/A2/video-storyboard.docx
+++ b/docs/A2/video-storyboard.docx
@@ -17,11 +17,7 @@
     </w:p>
     <w:p>
       <w:r>
-        <w:rPr>
-          <w:i/>
-          <w:color w:val="444444"/>
-        </w:rPr>
-        <w:t>D = David (Anrio) Carver — app, design patterns/OOP, CI/CD &amp; deployment.  C = Cameron Bruce — unit testing, API testing.  Read the quoted lines aloud; the red “SHOW” lines (and the images below them) are what to share on screen. Pre-open every tab and pre-log-in so there is no dead air. Keep the EC2 instance running.</w:t>
+        <w:t>Solo presentation by David (Anrio) Carver (D). My allocated teammate withdrew from the unit, so all work shown is my own. Read the quoted lines aloud; the ▶ SHOW lines are the on-screen visuals.</w:t>
       </w:r>
     </w:p>
     <w:p>
@@ -29,40 +25,22 @@
         <w:pStyle w:val="Heading2"/>
       </w:pPr>
       <w:r>
-        <w:t>0:00–0:40 — Intro (both on camera)</w:t>
+        <w:t>0:00–0:40 — Intro (David on camera)</w:t>
       </w:r>
     </w:p>
     <w:p>
       <w:r>
-        <w:rPr>
-          <w:b/>
-        </w:rPr>
-        <w:t xml:space="preserve">D: </w:t>
-      </w:r>
-      <w:r>
-        <w:t>“Hi, I’m David Carver.”</w:t>
+        <w:t>D: “Hi, I’m David Carver. This is my IFQ636 Assignment 2 — Mesa, a Restaurant Review Platform.”</w:t>
       </w:r>
     </w:p>
     <w:p>
       <w:r>
-        <w:rPr>
-          <w:b/>
-        </w:rPr>
-        <w:t xml:space="preserve">C: </w:t>
-      </w:r>
-      <w:r>
-        <w:t>“And I’m Cameron Bruce. This is our IFQ636 Assignment 2 — Mesa, a Restaurant Review Platform.”</w:t>
+        <w:t>D: “I completed this project solo — my allocated teammate withdrew from the unit, so everything you’ll see is my own work.”</w:t>
       </w:r>
     </w:p>
     <w:p>
       <w:r>
-        <w:rPr>
-          <w:b/>
-        </w:rPr>
-        <w:t xml:space="preserve">D: </w:t>
-      </w:r>
-      <w:r>
-        <w:t>“For A2 we re-architected the backend around object-oriented design and eight design patterns, added a new Notifications feature, expanded unit testing, added Postman API testing, and built a CI/CD pipeline that auto-deploys to AWS EC2. It’s live right now.”</w:t>
+        <w:t>D: “For A2 I re-architected the backend around object-oriented design and eight design patterns, added a new Notifications feature, expanded unit testing, did full API testing, and deployed it live with an automated CI/CD pipeline.”</w:t>
       </w:r>
     </w:p>
     <w:p>
@@ -190,13 +168,7 @@
     </w:p>
     <w:p>
       <w:r>
-        <w:rPr>
-          <w:b/>
-        </w:rPr>
-        <w:t xml:space="preserve">D: </w:t>
-      </w:r>
-      <w:r>
-        <w:t>“Here is the backend. We applied eight patterns — the rubric needs seven.”</w:t>
+        <w:t>D: “Here is the backend. I applied eight patterns — the rubric needs seven.”</w:t>
       </w:r>
     </w:p>
     <w:p>
@@ -291,29 +263,17 @@
         <w:pStyle w:val="Heading2"/>
       </w:pPr>
       <w:r>
-        <w:t>4:30–6:00 — Unit testing (Cameron, terminal)</w:t>
+        <w:t>4:30–6:00 — Unit testing (David, terminal)</w:t>
       </w:r>
     </w:p>
     <w:p>
       <w:r>
-        <w:rPr>
-          <w:b/>
-        </w:rPr>
-        <w:t xml:space="preserve">C: </w:t>
-      </w:r>
-      <w:r>
-        <w:t>“I handled testing. We use Mocha, Chai and Sinon — pure unit tests, no database; the Mongoose calls are stubbed.”</w:t>
+        <w:t>D: “For testing I use Mocha, Chai and Sinon — pure unit tests, no database; the Mongoose calls are stubbed.”</w:t>
       </w:r>
     </w:p>
     <w:p>
       <w:r>
-        <w:rPr>
-          <w:b/>
-        </w:rPr>
-        <w:t xml:space="preserve">C: </w:t>
-      </w:r>
-      <w:r>
-        <w:t>“Running npm test — 49 tests pass.”</w:t>
+        <w:t>D: “Running npm test — 49 tests pass.”</w:t>
       </w:r>
     </w:p>
     <w:p>
@@ -363,13 +323,7 @@
     </w:p>
     <w:p>
       <w:r>
-        <w:rPr>
-          <w:b/>
-        </w:rPr>
-        <w:t xml:space="preserve">C: </w:t>
-      </w:r>
-      <w:r>
-        <w:t>“For example, createReview returns 201 on success and 409 on a duplicate, and a pattern test verifies the Observer fans out correctly. Every backend function — create, fetch, update, delete — has a case in our test-case table.”</w:t>
+        <w:t>D: “For example, createReview returns 201 on success and 409 on a duplicate, and a pattern test verifies the Observer fans out correctly. Every backend function is covered.”</w:t>
       </w:r>
     </w:p>
     <w:p>
@@ -377,18 +331,12 @@
         <w:pStyle w:val="Heading2"/>
       </w:pPr>
       <w:r>
-        <w:t>6:00–7:15 — API testing (Cameron, Thunder Client / Postman)</w:t>
+        <w:t>6:00–7:15 — API testing (David, Thunder Client / Postman)</w:t>
       </w:r>
     </w:p>
     <w:p>
       <w:r>
-        <w:rPr>
-          <w:b/>
-        </w:rPr>
-        <w:t xml:space="preserve">C: </w:t>
-      </w:r>
-      <w:r>
-        <w:t>“I verified every endpoint and its error handling. Login returns 200 and a JWT; creating a review returns 201; sending it again returns 409.”</w:t>
+        <w:t>D: “I verified every endpoint and its error handling. Login returns 200 and a JWT; creating a review returns 201; sending it again returns 409.”</w:t>
       </w:r>
     </w:p>
     <w:p>
@@ -438,13 +386,7 @@
     </w:p>
     <w:p>
       <w:r>
-        <w:rPr>
-          <w:b/>
-        </w:rPr>
-        <w:t xml:space="preserve">C: </w:t>
-      </w:r>
-      <w:r>
-        <w:t>“Posting without a token returns 401; missing fields returns 400; and a diner trying to create a restaurant returns 403 — the role guard.”</w:t>
+        <w:t>D: “Posting without a token returns 401; missing fields returns 400; and a diner trying to create a restaurant returns 403 — the role guard.”</w:t>
       </w:r>
     </w:p>
     <w:p>
@@ -494,13 +436,7 @@
     </w:p>
     <w:p>
       <w:r>
-        <w:rPr>
-          <w:b/>
-        </w:rPr>
-        <w:t xml:space="preserve">C: </w:t>
-      </w:r>
-      <w:r>
-        <w:t>“The full collection is exported in the repo under docs/A2.”</w:t>
+        <w:t>D: “The full collection is exported in the repo under docs/A2.”</w:t>
       </w:r>
     </w:p>
     <w:p>
@@ -621,36 +557,22 @@
         <w:pStyle w:val="Heading2"/>
       </w:pPr>
       <w:r>
-        <w:t>9:00–9:40 — Team collaboration (both)</w:t>
+        <w:t>9:00–9:40 — GitHub workflow (David)</w:t>
       </w:r>
     </w:p>
     <w:p>
       <w:r>
-        <w:rPr>
-          <w:b/>
-        </w:rPr>
-        <w:t xml:space="preserve">C: </w:t>
-      </w:r>
-      <w:r>
-        <w:t>“We used GitHub with a feature-branch workflow — feature branches, pull requests, code reviews, and two resolved merge conflicts.”</w:t>
+        <w:t>D: “I used GitHub with a feature-branch workflow — feature branches, pull requests, and two merge conflicts I resolved. As my teammate withdrew, this is an individual demonstration of the collaboration workflow.”</w:t>
       </w:r>
     </w:p>
     <w:p>
       <w:r>
-        <w:rPr>
-          <w:b/>
-          <w:color w:val="B03030"/>
-        </w:rPr>
-        <w:t>▶ SHOW: LIVE — Insights → Contributors (commits per member), the branch list, a reviewed pull request, and a resolved merge-conflict commit.</w:t>
+        <w:t>▶ SHOW: LIVE — Insights → Contributors (commit history), the branch list, a pull request, and a resolved merge-conflict commit.</w:t>
       </w:r>
     </w:p>
     <w:p>
       <w:r>
-        <w:rPr>
-          <w:i/>
-          <w:color w:val="444444"/>
-        </w:rPr>
-        <w:t>Cameron records this part after he has done his commits/PR/review/merge-conflicts from his own account.</w:t>
+        <w:t>Note: this is a solo demonstration; the commit history is single-contributor.</w:t>
       </w:r>
     </w:p>
     <w:p>
@@ -658,7 +580,7 @@
         <w:pStyle w:val="Heading2"/>
       </w:pPr>
       <w:r>
-        <w:t>9:40–10:00 — Wrap (both)</w:t>
+        <w:t>9:40–10:00 — Wrap (David)</w:t>
       </w:r>
     </w:p>
     <w:p>
@@ -674,13 +596,7 @@
     </w:p>
     <w:p>
       <w:r>
-        <w:rPr>
-          <w:b/>
-        </w:rPr>
-        <w:t xml:space="preserve">C: </w:t>
-      </w:r>
-      <w:r>
-        <w:t>“Thanks for watching.”</w:t>
+        <w:t>D: “Thanks for watching.”</w:t>
       </w:r>
     </w:p>
     <w:p>
@@ -728,7 +644,7 @@
         <w:pStyle w:val="ListBullet"/>
       </w:pPr>
       <w:r>
-        <w:t>Both members must speak and screen-share their own parts (markers verify each member demonstrates their work).</w:t>
+        <w:t>Demonstrate and narrate each part yourself, screen-sharing your own work (the marker verifies the presenter demonstrates the work).</w:t>
       </w:r>
     </w:p>
     <w:p>

</xml_diff>